<commit_message>
Document quote precision and refresh supplier report downloads
</commit_message>
<xml_diff>
--- a/Website/static/downloads/integrations/supplier/SupplierReview.docx
+++ b/Website/static/downloads/integrations/supplier/SupplierReview.docx
@@ -480,8 +480,8 @@
       </w:r>
     </w:p>
     <w:sectPr>
-      <w:headerReference w:type="default" r:id="R4de25eb0a5d147a4"/>
-      <w:footerReference w:type="default" r:id="R92f5664f22e748e6"/>
+      <w:headerReference w:type="default" r:id="R0d74658b1d354652"/>
+      <w:footerReference w:type="default" r:id="R8a119718baeb481c"/>
       <w:pgSz w:w="12240" w:h="15840" w:code="1"/>
       <w:pgMar w:top="1440" w:right="1440" w:bottom="1440" w:left="1440" w:header="720" w:footer="720" w:gutter="0"/>
     </w:sectPr>
@@ -559,7 +559,7 @@
 <file path=word/numbering.xml><?xml version="1.0" encoding="utf-8"?>
 <w:numbering xmlns:wpc="http://schemas.microsoft.com/office/word/2010/wordprocessingCanvas" xmlns:cx="http://schemas.microsoft.com/office/drawing/2014/chartex" xmlns:cx1="http://schemas.microsoft.com/office/drawing/2015/9/8/chartex" xmlns:cx2="http://schemas.microsoft.com/office/drawing/2015/10/21/chartex" xmlns:cx3="http://schemas.microsoft.com/office/drawing/2016/5/9/chartex" xmlns:cx4="http://schemas.microsoft.com/office/drawing/2016/5/10/chartex" xmlns:cx5="http://schemas.microsoft.com/office/drawing/2016/5/11/chartex" xmlns:cx6="http://schemas.microsoft.com/office/drawing/2016/5/12/chartex" xmlns:cx7="http://schemas.microsoft.com/office/drawing/2016/5/13/chartex" xmlns:cx8="http://schemas.microsoft.com/office/drawing/2016/5/14/chartex" xmlns:mc="http://schemas.openxmlformats.org/markup-compatibility/2006" xmlns:aink="http://schemas.microsoft.com/office/drawing/2016/ink" xmlns:am3d="http://schemas.microsoft.com/office/drawing/2017/model3d" xmlns:o="urn:schemas-microsoft-com:office:office" xmlns:oel="http://schemas.microsoft.com/office/2019/extlst" xmlns:r="http://schemas.openxmlformats.org/officeDocument/2006/relationships" xmlns:m="http://schemas.openxmlformats.org/officeDocument/2006/math" xmlns:v="urn:schemas-microsoft-com:vml" xmlns:wp14="http://schemas.microsoft.com/office/word/2010/wordprocessingDrawing" xmlns:wp="http://schemas.openxmlformats.org/drawingml/2006/wordprocessingDrawing" xmlns:w10="urn:schemas-microsoft-com:office:word" xmlns:w="http://schemas.openxmlformats.org/wordprocessingml/2006/main" xmlns:w14="http://schemas.microsoft.com/office/word/2010/wordml" xmlns:w15="http://schemas.microsoft.com/office/word/2012/wordml" xmlns:w16cex="http://schemas.microsoft.com/office/word/2018/wordml/cex" xmlns:w16cid="http://schemas.microsoft.com/office/word/2016/wordml/cid" xmlns:w16="http://schemas.microsoft.com/office/word/2018/wordml" xmlns:w16sdtdh="http://schemas.microsoft.com/office/word/2020/wordml/sdtdatahash" xmlns:w16se="http://schemas.microsoft.com/office/word/2015/wordml/symex" xmlns:wpg="http://schemas.microsoft.com/office/word/2010/wordprocessingGroup" xmlns:wpi="http://schemas.microsoft.com/office/word/2010/wordprocessingInk" xmlns:wne="http://schemas.microsoft.com/office/word/2006/wordml" xmlns:wps="http://schemas.microsoft.com/office/word/2010/wordprocessingShape" mc:Ignorable="w14 w15 w16se w16cid w16 w16cex w16sdtdh wp14">
   <w:abstractNum w:abstractNumId="0" w15:restartNumberingAfterBreak="0">
-    <w:nsid w:val="D15BB5C6"/>
+    <w:nsid w:val="133A3056"/>
     <w:multiLevelType w:val="hybridMultilevel"/>
     <w:tmpl w:val="934E79A6"/>
     <w:lvl w:ilvl="0" w:tplc="04090001">

</xml_diff>